<commit_message>
Generalprobe und Klausuren: EH §8 als Hilfsmittel (Anlage) wie im Abitur
- Kopfzeile „Hilfsmittel: Operatorenübersicht, Ergänzende Hinweise §8 (Anlage)“ in allen Prüfungen und
  Erwartungshorizonten, Lehrerhinweise Akte 7 angepasst
- Anlage-Seite „Ergänzende Hinweise §8 – Datenbankabfragen“ am Ende von Generalprobe eA/gA,
  Klausur und Nachschreibklausur eA/gA; PDFs neu erzeugt, Spec §18

Co-Authored-By: Claude Opus 5.5 <noreply@anthropic.com>
Claude-Session: https://claude.ai/code/session_011AnrXShdxopZcriy7nmq9X
</commit_message>
<xml_diff>
--- a/materialien/Akte7_Generalprobe/2_Generalprobe/DD_A7_Generalprobe_eA.docx
+++ b/materialien/Akte7_Generalprobe/2_Generalprobe/DD_A7_Generalprobe_eA.docx
@@ -82,7 +82,7 @@
                 <w:color w:val="46525E"/>
                 <w:sz w:val="18"/>
               </w:rPr>
-              <w:t>Bearbeitungszeit: 70 Minuten · Hilfsmittel: Operatorenübersicht · Gesamt: 30 BE</w:t>
+              <w:t>Bearbeitungszeit: 70 Minuten · Hilfsmittel: Operatorenübersicht, Ergänzende Hinweise §8 (Anlage) · Gesamt: 30 BE</w:t>
             </w:r>
           </w:p>
         </w:tc>
@@ -8327,6 +8327,188 @@
         <w:t>LIMIT 3</w:t>
       </w:r>
     </w:p>
+    <w:p>
+      <w:r>
+        <w:br w:type="page"/>
+      </w:r>
+    </w:p>
+    <w:p>
+      <w:pPr>
+        <w:pStyle w:val="Heading1"/>
+      </w:pPr>
+      <w:r>
+        <w:t>Anlage · Ergänzende Hinweise §8 – Datenbankabfragen</w:t>
+      </w:r>
+    </w:p>
+    <w:p>
+      <w:pPr/>
+      <w:r>
+        <w:rPr>
+          <w:i/>
+        </w:rPr>
+        <w:t>Auszug aus den Ergänzenden Hinweisen zum Kerncurriculum Informatik (Niedersächsisches Kultusministerium, Neufassung Juni 2025), Abschnitt 8 – im Abitur als Hilfsmittel zugelassen.</w:t>
+      </w:r>
+    </w:p>
+    <w:p>
+      <w:pPr/>
+      <w:r>
+        <w:t>In den Aufgabenstellungen und in den erwarteten Lösungen wird die Abfragesprache SQL mit dem folgenden Sprachumfang unter Berücksichtigung der angegebenen Operatoren und Aggregatfunktionen verwendet. Verschachtelte SQL-Anweisungen werden im Rahmen der zentralen Prüfungsaufgaben nicht thematisiert.</w:t>
+      </w:r>
+    </w:p>
+    <w:p>
+      <w:pPr/>
+      <w:r>
+        <w:rPr>
+          <w:b/>
+        </w:rPr>
+        <w:t>SELECT-Anweisung:</w:t>
+      </w:r>
+    </w:p>
+    <w:p>
+      <w:pPr>
+        <w:spacing w:after="0"/>
+        <w:ind w:left="280"/>
+      </w:pPr>
+      <w:r>
+        <w:rPr>
+          <w:rFonts w:ascii="IBM Plex Mono" w:hAnsi="IBM Plex Mono" w:eastAsia="IBM Plex Mono" w:cs="IBM Plex Mono"/>
+          <w:sz w:val="19"/>
+        </w:rPr>
+        <w:t>SELECT [DISTINCT] * | spalte1 [AS s1], spalte2 [AS s2], …</w:t>
+      </w:r>
+    </w:p>
+    <w:p>
+      <w:pPr>
+        <w:spacing w:after="0"/>
+        <w:ind w:left="280"/>
+      </w:pPr>
+      <w:r>
+        <w:rPr>
+          <w:rFonts w:ascii="IBM Plex Mono" w:hAnsi="IBM Plex Mono" w:eastAsia="IBM Plex Mono" w:cs="IBM Plex Mono"/>
+          <w:sz w:val="19"/>
+        </w:rPr>
+        <w:t>FROM tabelle1 [t1], tabelle2 [t2], …</w:t>
+      </w:r>
+    </w:p>
+    <w:p>
+      <w:pPr>
+        <w:spacing w:after="0"/>
+        <w:ind w:left="280"/>
+      </w:pPr>
+      <w:r>
+        <w:rPr>
+          <w:rFonts w:ascii="IBM Plex Mono" w:hAnsi="IBM Plex Mono" w:eastAsia="IBM Plex Mono" w:cs="IBM Plex Mono"/>
+          <w:sz w:val="19"/>
+        </w:rPr>
+        <w:t>[WHERE bedingung1 (AND | OR) bedingung2 (AND | OR) … ]</w:t>
+      </w:r>
+    </w:p>
+    <w:p>
+      <w:pPr>
+        <w:spacing w:after="0"/>
+        <w:ind w:left="280"/>
+      </w:pPr>
+      <w:r>
+        <w:rPr>
+          <w:rFonts w:ascii="IBM Plex Mono" w:hAnsi="IBM Plex Mono" w:eastAsia="IBM Plex Mono" w:cs="IBM Plex Mono"/>
+          <w:sz w:val="19"/>
+        </w:rPr>
+        <w:t>[GROUP BY spalte1, spalte2, …</w:t>
+      </w:r>
+    </w:p>
+    <w:p>
+      <w:pPr>
+        <w:spacing w:after="0"/>
+        <w:ind w:left="280"/>
+      </w:pPr>
+      <w:r>
+        <w:rPr>
+          <w:rFonts w:ascii="IBM Plex Mono" w:hAnsi="IBM Plex Mono" w:eastAsia="IBM Plex Mono" w:cs="IBM Plex Mono"/>
+          <w:sz w:val="19"/>
+        </w:rPr>
+        <w:t>[HAVING gruppenBedingung1 (AND | OR) gruppenBedingung2 (AND | OR) …]]</w:t>
+      </w:r>
+    </w:p>
+    <w:p>
+      <w:pPr>
+        <w:spacing w:after="0"/>
+        <w:ind w:left="280"/>
+      </w:pPr>
+      <w:r>
+        <w:rPr>
+          <w:rFonts w:ascii="IBM Plex Mono" w:hAnsi="IBM Plex Mono" w:eastAsia="IBM Plex Mono" w:cs="IBM Plex Mono"/>
+          <w:sz w:val="19"/>
+        </w:rPr>
+        <w:t>[ORDER BY spalte1 [ASC | DESC], spalte2 [ASC | DESC], …]</w:t>
+      </w:r>
+    </w:p>
+    <w:p>
+      <w:pPr>
+        <w:spacing w:after="120"/>
+        <w:ind w:left="280"/>
+      </w:pPr>
+      <w:r>
+        <w:rPr>
+          <w:rFonts w:ascii="IBM Plex Mono" w:hAnsi="IBM Plex Mono" w:eastAsia="IBM Plex Mono" w:cs="IBM Plex Mono"/>
+          <w:sz w:val="19"/>
+        </w:rPr>
+        <w:t>[LIMIT anzahl]</w:t>
+      </w:r>
+    </w:p>
+    <w:p>
+      <w:pPr/>
+      <w:r>
+        <w:t>Angaben in eckigen Klammern sind optional. Spalten können Attribute, Aggregatfunktionen oder Berechnungen sein. Bei GROUP BY und ORDER BY ist auch die Angabe eines Alias möglich.</w:t>
+      </w:r>
+    </w:p>
+    <w:p>
+      <w:pPr/>
+      <w:r>
+        <w:rPr>
+          <w:b/>
+        </w:rPr>
+        <w:t xml:space="preserve">Operatoren für Berechnungen: </w:t>
+      </w:r>
+      <w:r>
+        <w:t>+, -, *, /</w:t>
+      </w:r>
+    </w:p>
+    <w:p>
+      <w:pPr/>
+      <w:r>
+        <w:rPr>
+          <w:b/>
+        </w:rPr>
+        <w:t xml:space="preserve">Operatoren für Vergleiche in Bedingungen: </w:t>
+      </w:r>
+      <w:r>
+        <w:t>=, != (ungleich), &gt;, &lt;, &gt;=, &lt;=, NOT, IS NULL, IN, BETWEEN, LIKE (mit den Platzhaltern _ (für genau ein Zeichen) und % (für beliebig viele Zeichen))</w:t>
+      </w:r>
+    </w:p>
+    <w:p>
+      <w:pPr/>
+      <w:r>
+        <w:rPr>
+          <w:b/>
+        </w:rPr>
+        <w:t xml:space="preserve">Aggregatfunktionen: </w:t>
+      </w:r>
+      <w:r>
+        <w:t>AVG, COUNT, MAX, MIN, SUM</w:t>
+      </w:r>
+    </w:p>
+    <w:p>
+      <w:pPr/>
+      <w:r>
+        <w:rPr>
+          <w:b/>
+        </w:rPr>
+        <w:t xml:space="preserve">Hinweis zur Verwendung von GROUP BY: </w:t>
+      </w:r>
+      <w:r>
+        <w:t>Bei einer Gruppierung müssen alle Spalten in der SELECT-Klausel entweder von einer Aggregatfunktion umschlossen oder explizit in der GROUP BY-Klausel aufgezählt sein.</w:t>
+      </w:r>
+    </w:p>
     <w:sectPr>
       <w:headerReference w:type="default" r:id="rId9"/>
       <w:footerReference w:type="default" r:id="rId10"/>

</xml_diff>